<commit_message>
Drop speaker 2 from the demo, add an audio cleanup pass for speaker 3
Speaker 2's shorter training run sounds clearly more synthetic (audible
high-frequency buzz) than speaker 3, so the interactive demo now only
offers speaker 3; both checkpoints stay published on Hugging Face for
comparison. All synthesized audio (demo + synthesize.py) is run through
a new light cleanup pass (spectral-gate denoise, high-shelf cut, peak
normalize) to reduce vocoder ringing without touching the model. README
and the report are updated to document the decision and set honest
expectations about the quality ceiling at this training scale.
</commit_message>
<xml_diff>
--- a/docs/report.docx
+++ b/docs/report.docx
@@ -217,6 +217,11 @@
       </w:r>
     </w:p>
     <w:p>
+      <w:r>
+        <w:t>Beyond the automated numbers, informal listening found speaker 2's output noticeably more synthetic-sounding than speaker 3's -- audible high-frequency buzz/ringing consistent with a checkpoint fine-tuned on less usable audio. For that reason the interactive demo only offers speaker 3; speaker 2 remains published on Hugging Face for comparison but is not demo-selectable. All synthesized output (both the demo and scripts/synthesize.py) is run through a light cleanup pass (src/akantts/postprocess.py: a spectral-gate denoise, a gentle high-frequency cut, and peak normalization) to reduce that artifact; this measurably cleans up the signal but does not change pronunciation, prosody, or the underlying data ceiling -- there is no standard percentage score for "how human" synthesized speech is (the field uses MOS, a 1-5 listening-test rating, not a percentage), and we do not claim one here.</w:t>
+      </w:r>
+    </w:p>
+    <w:p>
       <w:pPr>
         <w:pStyle w:val="Heading2"/>
       </w:pPr>
@@ -331,6 +336,14 @@
       </w:pPr>
       <w:r>
         <w:t>The native-speaker listening test was run against speaker-2 samples before the speaker-3 retrain; naturalness and tone for the final submitted (speaker-3) checkpoint are only indirectly evidenced, through the automated vowel-harmony metric above.</w:t>
+      </w:r>
+    </w:p>
+    <w:p>
+      <w:pPr>
+        <w:pStyle w:val="ListBullet"/>
+      </w:pPr>
+      <w:r>
+        <w:t>Audio naturalness is bounded by how little training data this scale of fine-tuning used (well under an hour for the final checkpoint); the post-processing cleanup pass (section 3.1) improves perceived clarity but cannot substitute for more data or longer training -- closing that gap further would need either.</w:t>
       </w:r>
     </w:p>
     <w:p>
@@ -453,7 +466,7 @@
         <w:pStyle w:val="ListBullet"/>
       </w:pPr>
       <w:r>
-        <w:t>Earlier speaker-2 checkpoint, reported above for comparison: https://huggingface.co/Lhue-Lhue/akan-tts-mms-vits</w:t>
+        <w:t>Earlier speaker-2 checkpoint, reported above for comparison, not demo-selectable: https://huggingface.co/Lhue-Lhue/akan-tts-mms-vits</w:t>
       </w:r>
     </w:p>
     <w:p>
@@ -461,7 +474,7 @@
         <w:pStyle w:val="ListBullet"/>
       </w:pPr>
       <w:r>
-        <w:t>Interactive demo (Gradio): scripts/demo_app.py, space/app.py</w:t>
+        <w:t>Interactive demo (Gradio): scripts/demo_app.py, space/app.py -- speaks with the speaker-3 checkpoint only</w:t>
       </w:r>
     </w:p>
     <w:p>

</xml_diff>

<commit_message>
Add an F0 prosody check and the in-person listening-test findings
scripts/eval_prosody.py extracts each clip's F0 (pitch) contour with
librosa's pYIN tracker as a naturalness/monotony proxy, separate from
CER/WER: speaker 2 and speaker 3 show comparable pitch variation, so
the clarity/tone preference for speaker 3 isn't explained by one
sounding flatter than the other. Report section 3.1 and the README
now cite these numbers.

Also records an informal, unscored in-person listening session with
the same three native speakers distributed the structured protocol
to: all three confirmed the output as Asante Twi and preferred
speaker 3 for audibility, pronunciation and tone over speaker 2.
Report sections 1, 3.2 and 4 (and the "Known limitations" bullets)
are updated to describe this alongside the still-pending structured,
scored protocol, and were retrimmed to stay within the four-page
limit.
</commit_message>
<xml_diff>
--- a/docs/report.docx
+++ b/docs/report.docx
@@ -20,32 +20,19 @@
       </w:r>
     </w:p>
     <w:p>
+      <w:pPr>
+        <w:jc w:val="center"/>
+      </w:pPr>
       <w:r>
-        <w:rPr>
-          <w:i/>
-          <w:color w:val="B00000"/>
-        </w:rPr>
-        <w:t>[PENDING -- author name(s)]</w:t>
-      </w:r>
-    </w:p>
-    <w:p>
-      <w:r>
-        <w:t xml:space="preserve">Akan variety: </w:t>
-      </w:r>
-      <w:r>
-        <w:rPr>
-          <w:i/>
-        </w:rPr>
-        <w:t>provisionally Asante Twi -- the orthography (final ɛ/ɔ in words such as deɛ, ahodoɔ) is consistent with the Asante Twi convention, but this has not been confirmed by a native speaker.</w:t>
+        <w:t>Lucienne Awoudi</w:t>
       </w:r>
     </w:p>
     <w:p>
       <w:r>
         <w:rPr>
           <w:i/>
-          <w:color w:val="B00000"/>
         </w:rPr>
-        <w:t>[PENDING -- confirm the variety with a native-speaker rater (brief Task 1, question 1) and replace the provisional statement above]</w:t>
+        <w:t>Akan variety: Asante Twi, identified from the orthography of the WAXAL twi_tts transcripts -- final ɛ and ɔ spellings (e.g. deɛ, ahodoɔ) are consistent with the Asante Twi convention, and three native speakers independently confirmed this by ear in an informal listening session (3.2). See the Discussion section.</w:t>
       </w:r>
     </w:p>
     <w:p>
@@ -58,7 +45,7 @@
     </w:p>
     <w:p>
       <w:r>
-        <w:t>Dataset: WAXAL [3], google/WaxalNLP, config twi_tts (Google Research with the University of Ghana, CC-BY-4.0). Studio-recorded, single speakers reading a phonetically balanced script. We fine-tuned on two of the four available speakers with an identical recipe: an initial run on speaker 2 (female), the cleanest by a loud/quiet-frame SNR-like proxy (50.7 dB), and the final submitted run on speaker 3 (male), who has the most usable short-clip audio of the four after filtering to clips of 20 seconds or less (0.58 h, 28% of his 2.1 h, versus 0.38 h / 14% for speaker 2) despite a lower SNR-like figure (43.6 dB) -- more short-clip training data outweighed the SNR gap. Most of the raw 8.9 hours sits in clips much longer than 20 s (VITS trains on short clips), so both runs relied on scripts/prepare_data.py's sentence-boundary cutting to recover usable audio from those longer recordings; see docs/dataset_survey.md for the full per-speaker table.</w:t>
+        <w:t>Dataset: WAXAL [3], google/WaxalNLP, config twi_tts (Google Research with the University of Ghana, CC-BY-4.0). Studio-recorded, single speakers reading a phonetically balanced script. We fine-tuned on two of the four available speakers with an identical recipe: speaker 2 (female), the cleanest by a loud/quiet-frame SNR-like proxy (50.7 dB), and speaker 3 (male), who has the most usable short-clip audio of the four after filtering to clips of 20 seconds or less (0.58 h, 28% of his 2.1 h, versus 0.38 h / 14% for speaker 2) despite a lower SNR-like figure (43.6 dB) and is the speaker whose checkpoint we ultimately submit as final (section 3 explains why). Most of the raw 8.9 hours sits in clips much longer than 20 s (VITS trains on short clips), so both runs relied on scripts/prepare_data.py's sentence-boundary cutting to recover usable audio from those longer recordings; see docs/dataset_survey.md for the full per-speaker table.</w:t>
       </w:r>
     </w:p>
     <w:p>
@@ -182,7 +169,7 @@
     </w:p>
     <w:p>
       <w:r>
-        <w:t>Computing environment: Google Colab, single NVIDIA T4 GPU. Training writes checkpoints directly to Google Drive so a Colab disconnect does not lose progress; converted checkpoints are cached there too so a runtime reset does not require re-downloading the base model.</w:t>
+        <w:t>Computing environment: speaker 2 trained on Google Colab (single NVIDIA T4 GPU), writing checkpoints directly to Google Drive so a disconnect does not lose progress and converted checkpoints are cached there too, avoiding a re-download of the base model after a runtime reset. Speaker 3 -- the final submitted checkpoint -- trained on Kaggle instead (scripts/kaggle_run_all.py), also on a single NVIDIA T4: Kaggle's default runtime offers two T4 GPUs, but a dual-GPU attempt hung partway through (an NCCL ALLGATHER deadlock, a multi-GPU interconnect issue rather than a code bug), so the script forces single-GPU execution (CUDA_VISIBLE_DEVICES=0) to match the recipe as validated on Colab. Kaggle has no Drive mount, so outputs are instead written to the kernel's own working directory and pulled down after the run completes.</w:t>
       </w:r>
     </w:p>
     <w:p>
@@ -208,17 +195,22 @@
     </w:p>
     <w:p>
       <w:r>
-        <w:t>Speaker 2 (pilot run), 20 held-out test-split prompts (scripts/eval_synthesis.py, seed 0): mean CER 0.211, mean WER 0.654. Vowel-harmony confusions in the ASR transcript, counted against the text the model was asked to say: e→ɛ 4, ɛ→e 6, o→ɔ 7, ɔ→o 6 (23 confusions total).</w:t>
+        <w:t>Speaker 2 (comparison run, published but not demo-selectable), 20 held-out test-split prompts (scripts/eval_synthesis.py, seed 0): mean CER 0.211, mean WER 0.654. Vowel-harmony confusions in the ASR transcript, counted against the text the model was asked to say: e→ɛ 4, ɛ→e 6, o→ɔ 7, ɔ→o 6 (23 confusions total).</w:t>
       </w:r>
     </w:p>
     <w:p>
       <w:r>
-        <w:t>Speaker 3 (final submitted checkpoint), same 20 held-out test-split prompts and procedure: mean CER 0.235, mean WER 0.617. Vowel-harmony confusions: e→ɛ 2, ɛ→e 0, o→ɔ 2, ɔ→o 3 (7 total). CER is slightly higher but WER is lower, and vowel-harmony confusions drop sharply (7 vs. 23) -- consistent with speaker 3's larger pool of usable short-clip training audio, though with only 20 prompts this is not a statistically rigorous comparison. WER being substantially higher than CER for both speakers is expected for a tonal, agglutinative-leaning orthography scored word-by-word -- a single wrong vowel can flip a whole word while leaving most characters correct. As noted above, facebook/mms-1b-all is itself an imperfect ASR model for Akan, so these numbers are an upper bound on the audio's true error, useful for ranking and spotting outliers rather than as an absolute score. Full per-prompt results for speaker 3 are in outputs/eval_speaker3_kaggle/eval_report.tsv.</w:t>
+        <w:t>Speaker 3 (final submitted checkpoint), same 20 held-out test-split prompts and procedure: mean CER 0.235, mean WER 0.617. Vowel-harmony confusions: e→ɛ 2, ɛ→e 0, o→ɔ 2, ɔ→o 3 (7 total). Speaker 2's CER is slightly lower and it drops fewer whole words on some sentences, which CER/WER do not isolate from substitution errors -- on that axis speaker 2 is the stronger checkpoint. We nonetheless submit speaker 3 as final: its vowel-harmony confusions are far fewer (7 vs. 23) and, as 3.2 below notes, it has less audible high-frequency buzz, and we weighted that clarity and pronunciation accuracy over speaker 2's edge in word-completeness. This is a genuine tradeoff rather than a one-sided win; section 4 discusses it further. WER being substantially higher than CER for both speakers is expected for a tonal, agglutinative-leaning orthography scored word-by-word -- a single wrong vowel can flip a whole word while leaving most characters correct. As noted above, facebook/mms-1b-all is itself an imperfect ASR model for Akan, so these numbers are an upper bound on the audio's true error, useful for ranking and spotting outliers rather than as an absolute score. Full per-prompt results for speaker 3 are in outputs/eval_speaker3_kaggle/eval_report.tsv.</w:t>
       </w:r>
     </w:p>
     <w:p>
       <w:r>
-        <w:t>Beyond the automated numbers, informal listening found speaker 2's output noticeably more synthetic-sounding than speaker 3's -- audible high-frequency buzz/ringing consistent with a checkpoint fine-tuned on less usable audio. For that reason the interactive demo only offers speaker 3; speaker 2 remains published on Hugging Face for comparison but is not demo-selectable. All synthesized output (both the demo and scripts/synthesize.py) is run through a light cleanup pass (src/akantts/postprocess.py: a spectral-gate denoise, a gentle high-frequency cut, and peak normalization) to reduce that artifact; this measurably cleans up the signal but does not change pronunciation, prosody, or the underlying data ceiling -- there is no standard percentage score for "how human" synthesized speech is (the field uses MOS, a 1-5 listening-test rating, not a percentage), and we do not claim one here.</w:t>
+        <w:t>Beyond the automated numbers, informal listening across both checkpoints found the same pattern: speaker 3 sounds less synthetic overall -- less audible high-frequency buzz/ringing -- but speaker 2 more reliably pronounces every syllable of a word rather than clipping or slurring it. We weighted speaker 3's clarity and pronunciation accuracy more heavily for the final submission (see above). The interactive demo therefore speaks with speaker 3; speaker 2 remains published on Hugging Face for comparison but is not demo-selectable. All synthesized output (both the demo and scripts/synthesize.py) is run through a light cleanup pass (src/akantts/postprocess.py: a spectral-gate denoise, a gentle high-frequency cut, and peak normalization) to reduce buzz on either checkpoint's output; this measurably cleans up the signal but does not change pronunciation, prosody, or the underlying data ceiling -- there is no standard percentage score for "how human" synthesized speech is (the field uses MOS, a 1-5 listening-test rating, not a percentage), and we do not claim one here.</w:t>
+      </w:r>
+    </w:p>
+    <w:p>
+      <w:r>
+        <w:t>As a further automated proxy -- not a tone or naturalness score -- we extracted each clip's F0 (pitch) contour with librosa's pYIN tracker (scripts/eval_prosody.py) on the same 20 prompts and the models' raw output. Speaker 2: mean F0 240.5 Hz, std-dev 52.3 Hz. Speaker 3: mean F0 177.7 Hz, std-dev 50.4 Hz. Pitch variation is comparable between the two (52.3 vs. 50.4 Hz) -- neither sounds flatter -- so this does not explain the clarity and tone preference for speaker 3 in 3.2; the mean-F0 gap instead reflects the speakers' different voice registers. Like CER/WER, this shows whether pitch varies, not whether it is tonally correct, since this orthography does not mark tone; see 3.2 for human judgment.</w:t>
       </w:r>
     </w:p>
     <w:p>
@@ -231,30 +223,17 @@
     </w:p>
     <w:p>
       <w:r>
-        <w:t>To cover naturalness and tone, three native speakers completed the tasks in docs/native_speaker_brief.md. Task 1 sanity-checked the natural recordings and a zero-shot (untrained) baseline, and identified the speaker's variety. Task 2 blind-rated 24 anonymized clips (8 natural, 8 zero-shot baseline, 8 fine-tuned, from the same 8 held-out sentences) on naturalness and intelligibility (1-5 each) and logged mispronounced words, paying particular attention to tone and vowel harmony. Task 3 produced new unseen test sentences in the natural speaker's variety.</w:t>
+        <w:t>Tone and perceived naturalness are outside what the automated metric in 3.1 can cover -- this orthography does not mark tone, and ASR-based scoring cannot judge how natural a clip sounds. To cover both, we designed a three-task listening protocol (docs/native_speaker_brief.md) and distributed it to three native speakers. Task 1 sanity-checks the natural recordings and a zero-shot (untrained) baseline, and identifies the speaker's variety. Task 2 blind-rates 24 anonymized clips (8 natural, 8 zero-shot baseline, 8 fine-tuned, from the same 8 held-out sentences) on naturalness and intelligibility (1-5 each) and logs mispronounced words, with particular attention to tone and vowel harmony. Task 3 elicits new unseen test sentences in the natural speaker's variety.</w:t>
       </w:r>
     </w:p>
     <w:p>
       <w:r>
-        <w:t>Note: the clips raters hear for the "fine-tuned" system in Task 2 are from the speaker-2 checkpoint -- the brief and samples were distributed before the speaker-3 retrain above was run. The listening-test results below therefore speak to the fine-tuning recipe in general (and to speaker 2 specifically), not to the speaker-3 checkpoint that is the final submitted model and demo. We flag rather than block on this: re-running Task 2 against speaker-3 samples is the obvious follow-up but was not possible within this submission's time.</w:t>
+        <w:t>Raters had not returned their written responses to this structured protocol by the submission deadline, so this report cannot present their scored naturalness, intelligibility, or tone judgments here; Section 4 discusses this gap directly. For the record, the Task 2 clips are drawn from the speaker-2 checkpoint, since the brief and samples were prepared before the speaker-3 decision below -- once returned, these results will speak most directly to the fine-tuning recipe in general and to speaker 2 specifically.</w:t>
       </w:r>
     </w:p>
     <w:p>
       <w:r>
-        <w:rPr>
-          <w:i/>
-          <w:color w:val="B00000"/>
-        </w:rPr>
-        <w:t>[PENDING -- Task 1 answers (confirmed variety, spelling consistency, audio quality)]</w:t>
-      </w:r>
-    </w:p>
-    <w:p>
-      <w:r>
-        <w:rPr>
-          <w:i/>
-          <w:color w:val="B00000"/>
-        </w:rPr>
-        <w:t>[PENDING -- Task 2 mean naturalness and intelligibility per system (natural / zero-shot / fine-tuned), plus notable mispronunciation / tone / vowel-harmony findings]</w:t>
+        <w:t>Separately, we ran an informal, unscored in-person session with the same three listeners: all three identified the output as Asante Twi (corroborating page 1), and all three found speaker 3 more audible, with clearer pronunciation and tone, and understood more of what was said, than speaker 2 -- while still noting room for improvement. This is qualitative feedback from three listeners in an unscored, non-blind setting, not the blind Task 2 ratings, so we treat it as supporting evidence rather than a substitute for the structured protocol's pending results.</w:t>
       </w:r>
     </w:p>
     <w:p>
@@ -267,11 +246,12 @@
     </w:p>
     <w:p>
       <w:r>
-        <w:rPr>
-          <w:i/>
-          <w:color w:val="B00000"/>
-        </w:rPr>
-        <w:t>[PENDING -- characterize failure modes once Task 2 results are in: which words/sounds the fine-tuned model mispronounces, tone errors flagged by raters, and any acoustic artifacts (clicks, buzzing, cut-off words) they reported]</w:t>
+        <w:t>Failure modes visible in the automated evaluation (3.1): vowel-harmony confusions are asymmetric and the pattern differs by speaker -- speaker 2's confusions split fairly evenly across all four directions (e→ɛ 4, ɛ→e 6, o→ɔ 7, ɔ→o 6), while speaker 3's smaller set skews toward closing the vowel (e→ɛ 2, o→ɔ 2, ɔ→o 3, no ɛ→e at all). We read this as the model defaulting to whichever realization was more frequent in its training data for each case, rather than a systematic harmony-direction bias -- with only 20 prompts and an imperfect ASR evaluator, this is a pattern worth confirming on more data, not a settled conclusion. WER running well above CER reflects how one wrong vowel can flip a whole word while leaving most characters correct -- a word-level failure CER understates. The audible high-frequency buzz (3.1) is a vocoder-training artifact, not a pronunciation error -- present throughout a clip regardless of content, consistent with a GAN-based vocoder not fully converged on this little data; cleanup (3.1) reduces but does not eliminate it. We cannot report scored tone-specific failures, since tone is not marked in the orthography and the structured listening test (3.2) had not returned numeric results by submission -- still the most significant gap here. The informal session (3.2) gave a matching qualitative signal -- clearer tone for speaker 3 -- but three unscored listeners cannot replace that protocol, so any stronger claim would be speculation.</w:t>
+      </w:r>
+    </w:p>
+    <w:p>
+      <w:r>
+        <w:t>A concrete word-level failure traced to root cause: "Akwaaba" (a common greeting) is consistently clipped or incomplete on both checkpoints. It appears exactly once in the full 872-utterance WAXAL twi_tts training split -- mid-sentence in a folk-tale spoken by speaker 4, whom we did not fine-tune on -- so neither checkpoint's training data contains it at all; the model is extrapolating an unfamiliar letter sequence rather than reproducing a learned pattern. This is a data-coverage gap, not a training or architecture deficiency, and more epochs or a different speaker would not fix it; we removed the word from the demo examples for this reason and expect the same for any other word this rare.</w:t>
       </w:r>
     </w:p>
     <w:p>
@@ -279,7 +259,7 @@
         <w:pStyle w:val="Heading2"/>
       </w:pPr>
       <w:r>
-        <w:t>Known limitations, independent of the pending results above:</w:t>
+        <w:t>Known limitations:</w:t>
       </w:r>
     </w:p>
     <w:p>
@@ -287,7 +267,7 @@
         <w:pStyle w:val="ListBullet"/>
       </w:pPr>
       <w:r>
-        <w:t>Tone is not marked in this orthography and so is not modeled explicitly; the model can only learn tone patterns indirectly from audio, and we can only evaluate it through human listening, not automated metrics.</w:t>
+        <w:t>Tone is not marked in this orthography and so is not modeled explicitly; only human listening -- not automated metrics -- can evaluate it. Three listeners informally judged speaker 3's tone clearer than speaker 2's (3.2), but the scored protocol has not yet returned results.</w:t>
       </w:r>
     </w:p>
     <w:p>
@@ -295,7 +275,7 @@
         <w:pStyle w:val="ListBullet"/>
       </w:pPr>
       <w:r>
-        <w:t>ɛ and ɔ pronunciation depends entirely on correct spelling surviving normalization; our normalize() maps look-alike and mis-encoded characters (Greek ε/ς, ↄ) onto the correct letters, but any source text with other encodings would need the same treatment.</w:t>
+        <w:t>ɛ and ɔ pronunciation depends on correct spelling surviving normalization; normalize() maps look-alike/mis-encoded characters (Greek ε/ς, ↄ) to the correct letters, but other encodings need the same treatment.</w:t>
       </w:r>
     </w:p>
     <w:p>
@@ -303,7 +283,7 @@
         <w:pStyle w:val="ListBullet"/>
       </w:pPr>
       <w:r>
-        <w:t>Single speaker only; no multi-speaker or voice-cloning support, and only ~2 hours of training audio, which is small for TTS fine-tuning.</w:t>
+        <w:t>Single speaker only, no voice-cloning support, and well under an hour of usable training audio for the final checkpoint -- small for TTS fine-tuning.</w:t>
       </w:r>
     </w:p>
     <w:p>
@@ -311,7 +291,7 @@
         <w:pStyle w:val="ListBullet"/>
       </w:pPr>
       <w:r>
-        <w:t>Digits are not expanded to words; input text containing numbers must already spell them out.</w:t>
+        <w:t>Digits are not expanded to words; numbers must already be spelled out.</w:t>
       </w:r>
     </w:p>
     <w:p>
@@ -319,7 +299,7 @@
         <w:pStyle w:val="ListBullet"/>
       </w:pPr>
       <w:r>
-        <w:t>The base model's licence (CC-BY-NC-4.0) restricts the fine-tuned checkpoint to non-commercial use.</w:t>
+        <w:t>The base model's licence (CC-BY-NC-4.0) restricts the checkpoint to non-commercial use.</w:t>
       </w:r>
     </w:p>
     <w:p>
@@ -327,7 +307,7 @@
         <w:pStyle w:val="ListBullet"/>
       </w:pPr>
       <w:r>
-        <w:t>Three raters: Task 2 results are reported per-rater as well as averaged; we do not claim statistical significance.</w:t>
+        <w:t>The Akan variety (Asante Twi, page 1) rests on our own orthographic determination, informally corroborated by three native speakers by ear (3.2); structured Task 1 verification had not returned a result by submission.</w:t>
       </w:r>
     </w:p>
     <w:p>
@@ -335,7 +315,7 @@
         <w:pStyle w:val="ListBullet"/>
       </w:pPr>
       <w:r>
-        <w:t>The native-speaker listening test was run against speaker-2 samples before the speaker-3 retrain; naturalness and tone for the final submitted (speaker-3) checkpoint are only indirectly evidenced, through the automated vowel-harmony metric above.</w:t>
+        <w:t>Audio naturalness is bounded by how little training data this fine-tuning used; cleanup (3.1) improves perceived clarity but cannot substitute for more data or longer training.</w:t>
       </w:r>
     </w:p>
     <w:p>
@@ -343,7 +323,7 @@
         <w:pStyle w:val="ListBullet"/>
       </w:pPr>
       <w:r>
-        <w:t>Audio naturalness is bounded by how little training data this scale of fine-tuning used (well under an hour for the final checkpoint); the post-processing cleanup pass (section 3.1) improves perceived clarity but cannot substitute for more data or longer training -- closing that gap further would need either.</w:t>
+        <w:t>Rare or unseen letter sequences mispronounce regardless of checkpoint choice (see the "Akwaaba" example above) -- a corpus-coverage limit, not a quality dial we can turn.</w:t>
       </w:r>
     </w:p>
     <w:p>
@@ -359,7 +339,7 @@
         <w:pStyle w:val="ListBullet"/>
       </w:pPr>
       <w:r>
-        <w:t>More training audio and a second speaker, to test whether quality or variety generalization improves.</w:t>
+        <w:t>Complete the structured, scored native-speaker listening protocol (docs/native_speaker_brief.md) for tone, naturalness, and variety judgments beyond the informal session already run (3.2).</w:t>
       </w:r>
     </w:p>
     <w:p>
@@ -367,7 +347,7 @@
         <w:pStyle w:val="ListBullet"/>
       </w:pPr>
       <w:r>
-        <w:t>An explicit tone-marking or tone-prediction step ahead of synthesis, evaluated directly against the native-speaker tone judgments rather than inferred from naturalness scores.</w:t>
+        <w:t>More training audio, including rare greetings, and a second speaker to test generalization.</w:t>
       </w:r>
     </w:p>
     <w:p>
@@ -375,7 +355,7 @@
         <w:pStyle w:val="ListBullet"/>
       </w:pPr>
       <w:r>
-        <w:t>A text-normalization pass for digit expansion, so numeric input does not need to be pre-written as words.</w:t>
+        <w:t>An explicit tone-marking/prediction step evaluated against native-speaker judgments, plus digit-expansion normalization.</w:t>
       </w:r>
     </w:p>
     <w:p>
@@ -466,7 +446,7 @@
         <w:pStyle w:val="ListBullet"/>
       </w:pPr>
       <w:r>
-        <w:t>Earlier speaker-2 checkpoint, reported above for comparison, not demo-selectable: https://huggingface.co/Lhue-Lhue/akan-tts-mms-vits</w:t>
+        <w:t>Speaker-2 checkpoint, reported above for comparison, not demo-selectable: https://huggingface.co/Lhue-Lhue/akan-tts-mms-vits</w:t>
       </w:r>
     </w:p>
     <w:p>
@@ -479,16 +459,12 @@
     </w:p>
     <w:p>
       <w:r>
-        <w:rPr>
-          <w:i/>
-          <w:color w:val="B00000"/>
-        </w:rPr>
-        <w:t>[PENDING -- shared folder link (audio samples + text prompts + checkpoint, accessible without a request) for the submission form]</w:t>
+        <w:t>A shared folder collecting audio samples, text prompts, and the model checkpoint together (per the submission guidelines) will accompany this report with the final submission form; in the interim, the checkpoint and generated samples are reachable from the links above.</w:t>
       </w:r>
     </w:p>
     <w:sectPr>
       <w:pgSz w:w="12240" w:h="15840"/>
-      <w:pgMar w:top="1008" w:right="1152" w:bottom="1008" w:left="1152" w:header="720" w:footer="720" w:gutter="0"/>
+      <w:pgMar w:top="864" w:right="1152" w:bottom="864" w:left="1152" w:header="720" w:footer="720" w:gutter="0"/>
       <w:cols w:space="720"/>
       <w:docGrid w:linePitch="360"/>
     </w:sectPr>
@@ -859,6 +835,9 @@
     <w:name w:val="Normal"/>
     <w:qFormat/>
     <w:rsid w:val="00FC693F"/>
+    <w:pPr>
+      <w:spacing w:after="100"/>
+    </w:pPr>
     <w:rPr>
       <w:sz w:val="21"/>
     </w:rPr>
@@ -1389,8 +1368,12 @@
       <w:numPr>
         <w:numId w:val="1"/>
       </w:numPr>
+      <w:spacing w:after="60"/>
       <w:contextualSpacing/>
     </w:pPr>
+    <w:rPr>
+      <w:sz w:val="21"/>
+    </w:rPr>
   </w:style>
   <w:style w:type="paragraph" w:styleId="ListBullet2">
     <w:name w:val="List Bullet 2"/>

</xml_diff>